<commit_message>
docs: manual con Resend, HeidiSQL y nuevo repositorio
Añade creación de cuenta y API key de Resend, pasos de HeidiSQL con
Laragon y actualiza la URL de clonación al repositorio del equipo.

Co-Authored-By: Claude Sonnet 5.5 <noreply@anthropic.com>
</commit_message>
<xml_diff>
--- a/docs/manual-instalacion-laragon.docx
+++ b/docs/manual-instalacion-laragon.docx
@@ -517,7 +517,7 @@
       <w:r>
         <w:drawing>
           <wp:inline xmlns:a="http://schemas.openxmlformats.org/drawingml/2006/main" xmlns:pic="http://schemas.openxmlformats.org/drawingml/2006/picture">
-            <wp:extent cx="5760720" cy="1728216"/>
+            <wp:extent cx="5760720" cy="1885327"/>
             <wp:docPr id="3" name="Picture 3"/>
             <wp:cNvGraphicFramePr>
               <a:graphicFrameLocks noChangeAspect="1"/>
@@ -538,7 +538,7 @@
                   <pic:spPr>
                     <a:xfrm>
                       <a:off x="0" y="0"/>
-                      <a:ext cx="5760720" cy="1728216"/>
+                      <a:ext cx="5760720" cy="1885327"/>
                     </a:xfrm>
                     <a:prstGeom prst="rect"/>
                   </pic:spPr>
@@ -589,14 +589,36 @@
         </w:rPr>
         <w:t>cd C:\laragon\www</w:t>
         <w:br/>
-        <w:t>git clone https://github.com/Josuemart555/sistema-hospitalario.git</w:t>
+        <w:t>git clone https://github.com/compilations-teams/sistema-hospitalario-integrado-SistenasII-2026-G4.git sistema-hospitalario</w:t>
         <w:br/>
         <w:t>cd sistema-hospitalario</w:t>
       </w:r>
     </w:p>
     <w:p>
       <w:r>
-        <w:t xml:space="preserve">Con </w:t>
+        <w:t xml:space="preserve">El nombre final </w:t>
+      </w:r>
+      <w:r>
+        <w:rPr>
+          <w:rFonts w:ascii="Consolas" w:hAnsi="Consolas"/>
+          <w:color w:val="B03060"/>
+          <w:sz w:val="20"/>
+        </w:rPr>
+        <w:t>sistema-hospitalario</w:t>
+      </w:r>
+      <w:r>
+        <w:t xml:space="preserve"> (último argumento de </w:t>
+      </w:r>
+      <w:r>
+        <w:rPr>
+          <w:rFonts w:ascii="Consolas" w:hAnsi="Consolas"/>
+          <w:color w:val="B03060"/>
+          <w:sz w:val="20"/>
+        </w:rPr>
+        <w:t>git clone</w:t>
+      </w:r>
+      <w:r>
+        <w:t xml:space="preserve">) es importante: con </w:t>
       </w:r>
       <w:r>
         <w:rPr>
@@ -605,7 +627,7 @@
         <w:t>Auto virtual hosts</w:t>
       </w:r>
       <w:r>
-        <w:t xml:space="preserve"> activado (Preferencias &gt; General), el sitio quedará en </w:t>
+        <w:t xml:space="preserve"> activado (Preferencias &gt; General), Laragon publica el sitio en </w:t>
       </w:r>
       <w:r>
         <w:rPr>
@@ -616,6 +638,17 @@
         <w:t>http://sistema-hospitalario.test</w:t>
       </w:r>
       <w:r>
+        <w:t xml:space="preserve">, que es el dominio que usa el </w:t>
+      </w:r>
+      <w:r>
+        <w:rPr>
+          <w:rFonts w:ascii="Consolas" w:hAnsi="Consolas"/>
+          <w:color w:val="B03060"/>
+          <w:sz w:val="20"/>
+        </w:rPr>
+        <w:t>.env</w:t>
+      </w:r>
+      <w:r>
         <w:t xml:space="preserve">. Si no aparece, pulse </w:t>
       </w:r>
       <w:r>
@@ -633,7 +666,144 @@
         <w:pStyle w:val="Heading1"/>
       </w:pPr>
       <w:r>
-        <w:t>4. Crear la base de datos</w:t>
+        <w:t>4. Crear la base de datos con HeidiSQL (incluido en Laragon)</w:t>
+      </w:r>
+    </w:p>
+    <w:p>
+      <w:r>
+        <w:t xml:space="preserve">Laragon trae </w:t>
+      </w:r>
+      <w:r>
+        <w:rPr>
+          <w:b/>
+        </w:rPr>
+        <w:t>HeidiSQL</w:t>
+      </w:r>
+      <w:r>
+        <w:t>, un programa visual para administrar MySQL. Con Laragon iniciado (MySQL en verde):</w:t>
+      </w:r>
+    </w:p>
+    <w:p>
+      <w:pPr>
+        <w:pStyle w:val="ListNumber"/>
+      </w:pPr>
+      <w:r>
+        <w:t xml:space="preserve">Menú de Laragon &gt; </w:t>
+      </w:r>
+      <w:r>
+        <w:rPr>
+          <w:b/>
+        </w:rPr>
+        <w:t>Base de datos</w:t>
+      </w:r>
+      <w:r>
+        <w:t xml:space="preserve"> &gt; </w:t>
+      </w:r>
+      <w:r>
+        <w:rPr>
+          <w:b/>
+        </w:rPr>
+        <w:t>HeidiSQL</w:t>
+      </w:r>
+      <w:r>
+        <w:t xml:space="preserve"> (o clic derecho en el ícono de Laragon &gt; Base de datos).</w:t>
+      </w:r>
+    </w:p>
+    <w:p>
+      <w:pPr>
+        <w:pStyle w:val="ListNumber"/>
+      </w:pPr>
+      <w:r>
+        <w:t xml:space="preserve">Se abre el </w:t>
+      </w:r>
+      <w:r>
+        <w:rPr>
+          <w:b/>
+        </w:rPr>
+        <w:t>Administrador de sesiones</w:t>
+      </w:r>
+      <w:r>
+        <w:t xml:space="preserve">. Seleccione la sesión </w:t>
+      </w:r>
+      <w:r>
+        <w:rPr>
+          <w:b/>
+        </w:rPr>
+        <w:t>Laragon</w:t>
+      </w:r>
+      <w:r>
+        <w:t xml:space="preserve"> que ya viene creada; si no existe, pulse </w:t>
+      </w:r>
+      <w:r>
+        <w:rPr>
+          <w:b/>
+        </w:rPr>
+        <w:t>Nueva</w:t>
+      </w:r>
+      <w:r>
+        <w:t xml:space="preserve"> y configure: Tipo de red </w:t>
+      </w:r>
+      <w:r>
+        <w:rPr>
+          <w:b/>
+        </w:rPr>
+        <w:t>MySQL (TCP/IP)</w:t>
+      </w:r>
+      <w:r>
+        <w:t xml:space="preserve">, host </w:t>
+      </w:r>
+      <w:r>
+        <w:rPr>
+          <w:b/>
+        </w:rPr>
+        <w:t>127.0.0.1</w:t>
+      </w:r>
+      <w:r>
+        <w:t xml:space="preserve">, usuario </w:t>
+      </w:r>
+      <w:r>
+        <w:rPr>
+          <w:b/>
+        </w:rPr>
+        <w:t>root</w:t>
+      </w:r>
+      <w:r>
+        <w:t xml:space="preserve">, contraseña </w:t>
+      </w:r>
+      <w:r>
+        <w:rPr>
+          <w:b/>
+        </w:rPr>
+        <w:t>vacía</w:t>
+      </w:r>
+      <w:r>
+        <w:t xml:space="preserve">, puerto </w:t>
+      </w:r>
+      <w:r>
+        <w:rPr>
+          <w:b/>
+        </w:rPr>
+        <w:t>3306</w:t>
+      </w:r>
+      <w:r>
+        <w:t>.</w:t>
+      </w:r>
+    </w:p>
+    <w:p>
+      <w:pPr>
+        <w:pStyle w:val="ListNumber"/>
+      </w:pPr>
+      <w:r>
+        <w:t xml:space="preserve">Pulse </w:t>
+      </w:r>
+      <w:r>
+        <w:rPr>
+          <w:b/>
+        </w:rPr>
+        <w:t>Abrir</w:t>
+      </w:r>
+      <w:r>
+        <w:t xml:space="preserve"> para conectarse.</w:t>
       </w:r>
     </w:p>
     <w:p>
@@ -643,7 +813,7 @@
       <w:r>
         <w:drawing>
           <wp:inline xmlns:a="http://schemas.openxmlformats.org/drawingml/2006/main" xmlns:pic="http://schemas.openxmlformats.org/drawingml/2006/picture">
-            <wp:extent cx="5760720" cy="1571105"/>
+            <wp:extent cx="5760720" cy="2932730"/>
             <wp:docPr id="4" name="Picture 4"/>
             <wp:cNvGraphicFramePr>
               <a:graphicFrameLocks noChangeAspect="1"/>
@@ -652,7 +822,7 @@
               <a:graphicData uri="http://schemas.openxmlformats.org/drawingml/2006/picture">
                 <pic:pic>
                   <pic:nvPicPr>
-                    <pic:cNvPr id="0" name="04-base-de-datos.png"/>
+                    <pic:cNvPr id="0" name="08-heidisql-sesion.png"/>
                     <pic:cNvPicPr/>
                   </pic:nvPicPr>
                   <pic:blipFill>
@@ -664,7 +834,7 @@
                   <pic:spPr>
                     <a:xfrm>
                       <a:off x="0" y="0"/>
-                      <a:ext cx="5760720" cy="1571105"/>
+                      <a:ext cx="5760720" cy="2932730"/>
                     </a:xfrm>
                     <a:prstGeom prst="rect"/>
                   </pic:spPr>
@@ -684,12 +854,50 @@
           <w:i/>
           <w:sz w:val="18"/>
         </w:rPr>
-        <w:t>Crear la base de datos</w:t>
+        <w:t>Sesión de HeidiSQL</w:t>
       </w:r>
     </w:p>
     <w:p>
-      <w:r>
-        <w:t xml:space="preserve">El MySQL de Laragon usa el usuario </w:t>
+      <w:pPr>
+        <w:pStyle w:val="ListNumber"/>
+      </w:pPr>
+      <w:r>
+        <w:t xml:space="preserve">En el panel izquierdo, clic derecho sobre la sesión (Laragon / 127.0.0.1) &gt; </w:t>
+      </w:r>
+      <w:r>
+        <w:rPr>
+          <w:b/>
+        </w:rPr>
+        <w:t>Crear nuevo</w:t>
+      </w:r>
+      <w:r>
+        <w:t xml:space="preserve"> &gt; </w:t>
+      </w:r>
+      <w:r>
+        <w:rPr>
+          <w:b/>
+        </w:rPr>
+        <w:t>Base de datos</w:t>
+      </w:r>
+      <w:r>
+        <w:t>.</w:t>
+      </w:r>
+    </w:p>
+    <w:p>
+      <w:pPr>
+        <w:pStyle w:val="ListNumber"/>
+      </w:pPr>
+      <w:r>
+        <w:t xml:space="preserve">En </w:t>
+      </w:r>
+      <w:r>
+        <w:rPr>
+          <w:b/>
+        </w:rPr>
+        <w:t>Nombre</w:t>
+      </w:r>
+      <w:r>
+        <w:t xml:space="preserve"> escriba </w:t>
       </w:r>
       <w:r>
         <w:rPr>
@@ -697,10 +905,122 @@
           <w:color w:val="B03060"/>
           <w:sz w:val="20"/>
         </w:rPr>
-        <w:t>root</w:t>
-      </w:r>
-      <w:r>
-        <w:t xml:space="preserve"> sin contraseña.</w:t>
+        <w:t>sistema_hospitalario</w:t>
+      </w:r>
+      <w:r>
+        <w:t>.</w:t>
+      </w:r>
+    </w:p>
+    <w:p>
+      <w:pPr>
+        <w:pStyle w:val="ListNumber"/>
+      </w:pPr>
+      <w:r>
+        <w:t xml:space="preserve">En </w:t>
+      </w:r>
+      <w:r>
+        <w:rPr>
+          <w:b/>
+        </w:rPr>
+        <w:t>Cotejamiento (Collation)</w:t>
+      </w:r>
+      <w:r>
+        <w:t xml:space="preserve"> elija </w:t>
+      </w:r>
+      <w:r>
+        <w:rPr>
+          <w:rFonts w:ascii="Consolas" w:hAnsi="Consolas"/>
+          <w:color w:val="B03060"/>
+          <w:sz w:val="20"/>
+        </w:rPr>
+        <w:t>utf8mb4_unicode_ci</w:t>
+      </w:r>
+      <w:r>
+        <w:t>.</w:t>
+      </w:r>
+    </w:p>
+    <w:p>
+      <w:pPr>
+        <w:pStyle w:val="ListNumber"/>
+      </w:pPr>
+      <w:r>
+        <w:t xml:space="preserve">Pulse </w:t>
+      </w:r>
+      <w:r>
+        <w:rPr>
+          <w:b/>
+        </w:rPr>
+        <w:t>Aceptar</w:t>
+      </w:r>
+      <w:r>
+        <w:t xml:space="preserve">. La base aparecerá en el listado de la izquierda (vacía, las tablas las crea </w:t>
+      </w:r>
+      <w:r>
+        <w:rPr>
+          <w:rFonts w:ascii="Consolas" w:hAnsi="Consolas"/>
+          <w:color w:val="B03060"/>
+          <w:sz w:val="20"/>
+        </w:rPr>
+        <w:t>php artisan migrate</w:t>
+      </w:r>
+      <w:r>
+        <w:t>).</w:t>
+      </w:r>
+    </w:p>
+    <w:p>
+      <w:pPr>
+        <w:jc w:val="center"/>
+      </w:pPr>
+      <w:r>
+        <w:drawing>
+          <wp:inline xmlns:a="http://schemas.openxmlformats.org/drawingml/2006/main" xmlns:pic="http://schemas.openxmlformats.org/drawingml/2006/picture">
+            <wp:extent cx="5760720" cy="2932730"/>
+            <wp:docPr id="5" name="Picture 5"/>
+            <wp:cNvGraphicFramePr>
+              <a:graphicFrameLocks noChangeAspect="1"/>
+            </wp:cNvGraphicFramePr>
+            <a:graphic>
+              <a:graphicData uri="http://schemas.openxmlformats.org/drawingml/2006/picture">
+                <pic:pic>
+                  <pic:nvPicPr>
+                    <pic:cNvPr id="0" name="09-heidisql-crear-bd.png"/>
+                    <pic:cNvPicPr/>
+                  </pic:nvPicPr>
+                  <pic:blipFill>
+                    <a:blip r:embed="rId13"/>
+                    <a:stretch>
+                      <a:fillRect/>
+                    </a:stretch>
+                  </pic:blipFill>
+                  <pic:spPr>
+                    <a:xfrm>
+                      <a:off x="0" y="0"/>
+                      <a:ext cx="5760720" cy="2932730"/>
+                    </a:xfrm>
+                    <a:prstGeom prst="rect"/>
+                  </pic:spPr>
+                </pic:pic>
+              </a:graphicData>
+            </a:graphic>
+          </wp:inline>
+        </w:drawing>
+      </w:r>
+    </w:p>
+    <w:p>
+      <w:pPr>
+        <w:jc w:val="center"/>
+      </w:pPr>
+      <w:r>
+        <w:rPr>
+          <w:i/>
+          <w:sz w:val="18"/>
+        </w:rPr>
+        <w:t>Crear la base de datos</w:t>
+      </w:r>
+    </w:p>
+    <w:p>
+      <w:r>
+        <w:t>Alternativa sin interfaz, desde la Terminal de Laragon:</w:t>
       </w:r>
     </w:p>
     <w:p>
@@ -717,8 +1037,172 @@
       </w:r>
     </w:p>
     <w:p>
-      <w:r>
-        <w:t>También puede crearla con el menú Laragon &gt; Base de datos &gt; HeidiSQL (botón derecho &gt; Crear nueva &gt; Base de datos).</w:t>
+      <w:pPr>
+        <w:pStyle w:val="Heading1"/>
+      </w:pPr>
+      <w:r>
+        <w:t>5. Crear la cuenta de Resend y obtener la API key</w:t>
+      </w:r>
+    </w:p>
+    <w:p>
+      <w:r>
+        <w:t xml:space="preserve">El sistema envía correos (código de verificación en dos pasos y recuperación de contraseña) con </w:t>
+      </w:r>
+      <w:r>
+        <w:rPr>
+          <w:b/>
+        </w:rPr>
+        <w:t>Resend</w:t>
+      </w:r>
+      <w:r>
+        <w:t>. Necesita una cuenta gratuita y una API key:</w:t>
+      </w:r>
+    </w:p>
+    <w:p>
+      <w:pPr>
+        <w:pStyle w:val="ListNumber"/>
+      </w:pPr>
+      <w:r>
+        <w:t xml:space="preserve">Entre a https://resend.com y pulse </w:t>
+      </w:r>
+      <w:r>
+        <w:rPr>
+          <w:b/>
+        </w:rPr>
+        <w:t>Sign up</w:t>
+      </w:r>
+      <w:r>
+        <w:t xml:space="preserve"> (puede registrarse con correo o GitHub). Confirme su correo.</w:t>
+      </w:r>
+    </w:p>
+    <w:p>
+      <w:pPr>
+        <w:pStyle w:val="ListNumber"/>
+      </w:pPr>
+      <w:r>
+        <w:t xml:space="preserve">Dentro del panel, vaya a </w:t>
+      </w:r>
+      <w:r>
+        <w:rPr>
+          <w:b/>
+        </w:rPr>
+        <w:t>API Keys</w:t>
+      </w:r>
+      <w:r>
+        <w:t xml:space="preserve"> &gt; </w:t>
+      </w:r>
+      <w:r>
+        <w:rPr>
+          <w:b/>
+        </w:rPr>
+        <w:t>Create API Key</w:t>
+      </w:r>
+      <w:r>
+        <w:t>.</w:t>
+      </w:r>
+    </w:p>
+    <w:p>
+      <w:pPr>
+        <w:pStyle w:val="ListNumber"/>
+      </w:pPr>
+      <w:r>
+        <w:t xml:space="preserve">Escriba un nombre (por ejemplo </w:t>
+      </w:r>
+      <w:r>
+        <w:rPr>
+          <w:rFonts w:ascii="Consolas" w:hAnsi="Consolas"/>
+          <w:color w:val="B03060"/>
+          <w:sz w:val="20"/>
+        </w:rPr>
+        <w:t>sistema-hospitalario-local</w:t>
+      </w:r>
+      <w:r>
+        <w:t xml:space="preserve">), elija el permiso </w:t>
+      </w:r>
+      <w:r>
+        <w:rPr>
+          <w:b/>
+        </w:rPr>
+        <w:t>Sending access</w:t>
+      </w:r>
+      <w:r>
+        <w:t xml:space="preserve"> y pulse </w:t>
+      </w:r>
+      <w:r>
+        <w:rPr>
+          <w:b/>
+        </w:rPr>
+        <w:t>Add</w:t>
+      </w:r>
+      <w:r>
+        <w:t>.</w:t>
+      </w:r>
+    </w:p>
+    <w:p>
+      <w:pPr>
+        <w:pStyle w:val="ListNumber"/>
+      </w:pPr>
+      <w:r>
+        <w:t xml:space="preserve">Copie la clave que empieza con </w:t>
+      </w:r>
+      <w:r>
+        <w:rPr>
+          <w:rFonts w:ascii="Consolas" w:hAnsi="Consolas"/>
+          <w:color w:val="B03060"/>
+          <w:sz w:val="20"/>
+        </w:rPr>
+        <w:t>re_</w:t>
+      </w:r>
+      <w:r>
+        <w:t xml:space="preserve">. </w:t>
+      </w:r>
+      <w:r>
+        <w:rPr>
+          <w:b/>
+        </w:rPr>
+        <w:t>Solo se muestra una vez</w:t>
+      </w:r>
+      <w:r>
+        <w:t>; guárdela en un lugar seguro.</w:t>
+      </w:r>
+    </w:p>
+    <w:p>
+      <w:pPr>
+        <w:pStyle w:val="ListNumber"/>
+      </w:pPr>
+      <w:r>
+        <w:t xml:space="preserve">Péguela en el archivo </w:t>
+      </w:r>
+      <w:r>
+        <w:rPr>
+          <w:rFonts w:ascii="Consolas" w:hAnsi="Consolas"/>
+          <w:color w:val="B03060"/>
+          <w:sz w:val="20"/>
+        </w:rPr>
+        <w:t>.env</w:t>
+      </w:r>
+      <w:r>
+        <w:t xml:space="preserve"> (paso 6) en la línea </w:t>
+      </w:r>
+      <w:r>
+        <w:rPr>
+          <w:rFonts w:ascii="Consolas" w:hAnsi="Consolas"/>
+          <w:color w:val="B03060"/>
+          <w:sz w:val="20"/>
+        </w:rPr>
+        <w:t>RESEND_API_KEY=</w:t>
+      </w:r>
+      <w:r>
+        <w:t>.</w:t>
+      </w:r>
+    </w:p>
+    <w:p>
+      <w:r>
+        <w:rPr>
+          <w:i/>
+          <w:color w:val="666666"/>
+        </w:rPr>
+        <w:t>Nota: Con el remitente de pruebas onboarding@resend.dev, Resend solo entrega correos al correo con el que se registró en su cuenta. Para enviar a cualquier usuario, verifique un dominio propio en Resend &gt; Domains y use un remitente de ese dominio en MAIL_FROM_ADDRESS. Nunca suba la API key a Git ni la comparta: el archivo .env está ignorado por Git.</w:t>
       </w:r>
     </w:p>
     <w:p>
@@ -726,7 +1210,7 @@
         <w:pStyle w:val="Heading1"/>
       </w:pPr>
       <w:r>
-        <w:t>5. Instalar dependencias y configurar</w:t>
+        <w:t>6. Instalar dependencias y configurar</w:t>
       </w:r>
     </w:p>
     <w:p>
@@ -737,7 +1221,7 @@
         <w:drawing>
           <wp:inline xmlns:a="http://schemas.openxmlformats.org/drawingml/2006/main" xmlns:pic="http://schemas.openxmlformats.org/drawingml/2006/picture">
             <wp:extent cx="5760720" cy="2723249"/>
-            <wp:docPr id="5" name="Picture 5"/>
+            <wp:docPr id="6" name="Picture 6"/>
             <wp:cNvGraphicFramePr>
               <a:graphicFrameLocks noChangeAspect="1"/>
             </wp:cNvGraphicFramePr>
@@ -749,7 +1233,7 @@
                     <pic:cNvPicPr/>
                   </pic:nvPicPr>
                   <pic:blipFill>
-                    <a:blip r:embed="rId13"/>
+                    <a:blip r:embed="rId14"/>
                     <a:stretch>
                       <a:fillRect/>
                     </a:stretch>
@@ -815,7 +1299,7 @@
         <w:t>.env</w:t>
       </w:r>
       <w:r>
-        <w:t xml:space="preserve"> (siguiente imagen). Por defecto viene configurado para SQLite; hay que cambiarlo a MySQL.</w:t>
+        <w:t xml:space="preserve"> (siguiente imagen). Por defecto viene configurado para SQLite: cambie a MySQL y agregue la API key de Resend del paso 5.</w:t>
       </w:r>
     </w:p>
     <w:p>
@@ -825,8 +1309,8 @@
       <w:r>
         <w:drawing>
           <wp:inline xmlns:a="http://schemas.openxmlformats.org/drawingml/2006/main" xmlns:pic="http://schemas.openxmlformats.org/drawingml/2006/picture">
-            <wp:extent cx="5760720" cy="2723249"/>
-            <wp:docPr id="6" name="Picture 6"/>
+            <wp:extent cx="5760720" cy="3037471"/>
+            <wp:docPr id="7" name="Picture 7"/>
             <wp:cNvGraphicFramePr>
               <a:graphicFrameLocks noChangeAspect="1"/>
             </wp:cNvGraphicFramePr>
@@ -838,7 +1322,7 @@
                     <pic:cNvPicPr/>
                   </pic:nvPicPr>
                   <pic:blipFill>
-                    <a:blip r:embed="rId14"/>
+                    <a:blip r:embed="rId15"/>
                     <a:stretch>
                       <a:fillRect/>
                     </a:stretch>
@@ -846,7 +1330,7 @@
                   <pic:spPr>
                     <a:xfrm>
                       <a:off x="0" y="0"/>
-                      <a:ext cx="5760720" cy="2723249"/>
+                      <a:ext cx="5760720" cy="3037471"/>
                     </a:xfrm>
                     <a:prstGeom prst="rect"/>
                   </pic:spPr>
@@ -899,7 +1383,11 @@
         <w:t>DB_PASSWORD=</w:t>
         <w:br/>
         <w:br/>
-        <w:t>MAIL_MAILER=log</w:t>
+        <w:t>MAIL_MAILER=resend</w:t>
+        <w:br/>
+        <w:t>MAIL_FROM_ADDRESS="onboarding@resend.dev"</w:t>
+        <w:br/>
+        <w:t>RESEND_API_KEY=re_su_clave_aqui</w:t>
       </w:r>
     </w:p>
     <w:p>
@@ -908,7 +1396,7 @@
           <w:i/>
           <w:color w:val="666666"/>
         </w:rPr>
-        <w:t>Nota: Con MAIL_MAILER=log los correos no se envían: se guardan en storage\logs\laravel.log. Para enviarlos de verdad con Resend, agregue RESEND_API_KEY=su_clave y cambie MAIL_MAILER=resend. Nunca suba el archivo .env a Git.</w:t>
+        <w:t>Nota: Pegue su API key real de Resend en RESEND_API_KEY. Sin ella el inicio de sesión con código por correo y la recuperación de contraseña fallarán. Solo para pruebas sin cuenta de Resend puede usar MAIL_MAILER=log: los correos no se envían y se guardan en storage\logs\laravel.log. Después de editar el .env ejecute php artisan config:clear.</w:t>
       </w:r>
     </w:p>
     <w:p>
@@ -916,7 +1404,7 @@
         <w:pStyle w:val="Heading1"/>
       </w:pPr>
       <w:r>
-        <w:t>6. Migraciones, seeders y primer usuario</w:t>
+        <w:t>7. Migraciones, seeders y primer usuario</w:t>
       </w:r>
     </w:p>
     <w:p>
@@ -1063,7 +1551,7 @@
         <w:pStyle w:val="Heading1"/>
       </w:pPr>
       <w:r>
-        <w:t>7. Compilar el frontend</w:t>
+        <w:t>8. Compilar el frontend</w:t>
       </w:r>
     </w:p>
     <w:p>
@@ -1155,7 +1643,7 @@
         <w:pStyle w:val="Heading1"/>
       </w:pPr>
       <w:r>
-        <w:t>8. Iniciar sesión</w:t>
+        <w:t>9. Iniciar sesión</w:t>
       </w:r>
     </w:p>
     <w:p>
@@ -1166,7 +1654,7 @@
         <w:drawing>
           <wp:inline xmlns:a="http://schemas.openxmlformats.org/drawingml/2006/main" xmlns:pic="http://schemas.openxmlformats.org/drawingml/2006/picture">
             <wp:extent cx="5760720" cy="2723249"/>
-            <wp:docPr id="7" name="Picture 7"/>
+            <wp:docPr id="8" name="Picture 8"/>
             <wp:cNvGraphicFramePr>
               <a:graphicFrameLocks noChangeAspect="1"/>
             </wp:cNvGraphicFramePr>
@@ -1178,7 +1666,7 @@
                     <pic:cNvPicPr/>
                   </pic:nvPicPr>
                   <pic:blipFill>
-                    <a:blip r:embed="rId15"/>
+                    <a:blip r:embed="rId16"/>
                     <a:stretch>
                       <a:fillRect/>
                     </a:stretch>
@@ -1289,7 +1777,7 @@
         <w:t>Exigir código de verificación por correo al iniciar sesión</w:t>
       </w:r>
       <w:r>
-        <w:t xml:space="preserve">, después de la contraseña se pedirá un código de 6 dígitos. Con </w:t>
+        <w:t xml:space="preserve">, después de la contraseña se pedirá un código de 6 dígitos. El código llega por correo mediante Resend (si usa </w:t>
       </w:r>
       <w:r>
         <w:rPr>
@@ -1300,7 +1788,7 @@
         <w:t>MAIL_MAILER=log</w:t>
       </w:r>
       <w:r>
-        <w:t xml:space="preserve"> el código se encuentra dentro de </w:t>
+        <w:t xml:space="preserve"> aparece dentro de </w:t>
       </w:r>
       <w:r>
         <w:rPr>
@@ -1311,7 +1799,7 @@
         <w:t>storage\logs\laravel.log</w:t>
       </w:r>
       <w:r>
-        <w:t xml:space="preserve"> (busque "Su código de verificación"). Con Resend, llega al correo del usuario; el remitente </w:t>
+        <w:t xml:space="preserve">, buscando "Su código de verificación"). Con el remitente </w:t>
       </w:r>
       <w:r>
         <w:rPr>
@@ -1322,7 +1810,7 @@
         <w:t>onboarding@resend.dev</w:t>
       </w:r>
       <w:r>
-        <w:t xml:space="preserve"> solo entrega al dueño de la cuenta de Resend hasta que se verifique un dominio propio.</w:t>
+        <w:t xml:space="preserve"> solo recibe el correo de la cuenta dueña de Resend hasta que se verifique un dominio propio.</w:t>
       </w:r>
     </w:p>
     <w:p>
@@ -1330,7 +1818,7 @@
         <w:pStyle w:val="Heading1"/>
       </w:pPr>
       <w:r>
-        <w:t>9. Ejecutar las pruebas (opcional)</w:t>
+        <w:t>10. Ejecutar las pruebas (opcional)</w:t>
       </w:r>
     </w:p>
     <w:p>
@@ -1367,7 +1855,7 @@
         <w:pStyle w:val="Heading1"/>
       </w:pPr>
       <w:r>
-        <w:t>10. Problemas frecuentes</w:t>
+        <w:t>11. Problemas frecuentes</w:t>
       </w:r>
     </w:p>
     <w:p>
@@ -1471,7 +1959,7 @@
         <w:t>`SQLSTATE[HY000] [1049] Unknown database`</w:t>
       </w:r>
       <w:r>
-        <w:t xml:space="preserve">: falta crear la base (paso 4) o el nombre en </w:t>
+        <w:t xml:space="preserve">: falta crear la base (paso 4, HeidiSQL) o el nombre en </w:t>
       </w:r>
       <w:r>
         <w:rPr>
@@ -1624,7 +2112,7 @@
         </w:rPr>
         <w:t>cd C:\laragon\www</w:t>
         <w:br/>
-        <w:t>git clone https://github.com/Josuemart555/sistema-hospitalario.git</w:t>
+        <w:t>git clone https://github.com/compilations-teams/sistema-hospitalario-integrado-SistenasII-2026-G4.git sistema-hospitalario</w:t>
         <w:br/>
         <w:t>cd sistema-hospitalario</w:t>
         <w:br/>
@@ -1636,7 +2124,7 @@
         <w:br/>
         <w:t>php artisan key:generate</w:t>
         <w:br/>
-        <w:t>:: edite .env (MySQL, APP_URL, APP_LOCALE)</w:t>
+        <w:t>:: edite .env (MySQL, APP_URL, APP_LOCALE y RESEND_API_KEY)</w:t>
         <w:br/>
         <w:t>php artisan storage:link</w:t>
         <w:br/>

</xml_diff>